<commit_message>
add new feature (Halftime, gameend)
</commit_message>
<xml_diff>
--- a/src/main/resources/pictures/template/men/teamTemp.docx
+++ b/src/main/resources/pictures/template/men/teamTemp.docx
@@ -15,18 +15,18 @@
         <mc:AlternateContent>
           <mc:Choice Requires="wps">
             <w:drawing>
-              <wp:anchor distT="0" distB="0" distL="114300" distR="114300" simplePos="0" relativeHeight="251730944" behindDoc="0" locked="0" layoutInCell="1" allowOverlap="1" wp14:anchorId="14148F2F" wp14:editId="0722C79B">
+              <wp:anchor distT="0" distB="0" distL="114300" distR="114300" simplePos="0" relativeHeight="251732992" behindDoc="0" locked="0" layoutInCell="1" allowOverlap="1" wp14:anchorId="66066D0F" wp14:editId="7A9F03C9">
                 <wp:simplePos x="0" y="0"/>
                 <wp:positionH relativeFrom="margin">
-                  <wp:posOffset>996950</wp:posOffset>
+                  <wp:posOffset>473710</wp:posOffset>
                 </wp:positionH>
                 <wp:positionV relativeFrom="paragraph">
-                  <wp:posOffset>12195183</wp:posOffset>
+                  <wp:posOffset>13150917</wp:posOffset>
                 </wp:positionV>
-                <wp:extent cx="6198738" cy="2256311"/>
+                <wp:extent cx="7283669" cy="457200"/>
                 <wp:effectExtent l="0" t="0" r="0" b="0"/>
                 <wp:wrapNone/>
-                <wp:docPr id="1869927516" name="Textfeld 2"/>
+                <wp:docPr id="1927474992" name="Textfeld 2"/>
                 <wp:cNvGraphicFramePr>
                   <a:graphicFrameLocks xmlns:a="http://schemas.openxmlformats.org/drawingml/2006/main"/>
                 </wp:cNvGraphicFramePr>
@@ -39,7 +39,7 @@
                       <wps:spPr bwMode="auto">
                         <a:xfrm>
                           <a:off x="0" y="0"/>
-                          <a:ext cx="6198738" cy="2256311"/>
+                          <a:ext cx="7283669" cy="457200"/>
                         </a:xfrm>
                         <a:prstGeom prst="rect">
                           <a:avLst/>
@@ -60,8 +60,8 @@
                               <w:rPr>
                                 <w:rFonts w:ascii="Modern No. 20" w:hAnsi="Modern No. 20"/>
                                 <w:color w:val="C00000"/>
-                                <w:sz w:val="130"/>
-                                <w:szCs w:val="130"/>
+                                <w:sz w:val="44"/>
+                                <w:szCs w:val="44"/>
                                 <w14:glow w14:rad="101600">
                                   <w14:srgbClr w14:val="C00000">
                                     <w14:alpha w14:val="40000"/>
@@ -80,8 +80,8 @@
                               <w:rPr>
                                 <w:rFonts w:ascii="Modern No. 20" w:hAnsi="Modern No. 20"/>
                                 <w:color w:val="000000" w:themeColor="text1"/>
-                                <w:sz w:val="130"/>
-                                <w:szCs w:val="130"/>
+                                <w:sz w:val="44"/>
+                                <w:szCs w:val="44"/>
                                 <w14:glow w14:rad="101600">
                                   <w14:srgbClr w14:val="C00000">
                                     <w14:alpha w14:val="40000"/>
@@ -95,7 +95,70 @@
                                   <w14:bevel/>
                                 </w14:textOutline>
                               </w:rPr>
-                              <w:t>AUF GEHT’S WÖLFE</w:t>
+                              <w:t>Verfolgt das Spiel Live über unseren What</w:t>
+                            </w:r>
+                            <w:r>
+                              <w:rPr>
+                                <w:rFonts w:ascii="Modern No. 20" w:hAnsi="Modern No. 20"/>
+                                <w:color w:val="000000" w:themeColor="text1"/>
+                                <w:sz w:val="44"/>
+                                <w:szCs w:val="44"/>
+                                <w14:glow w14:rad="101600">
+                                  <w14:srgbClr w14:val="C00000">
+                                    <w14:alpha w14:val="40000"/>
+                                  </w14:srgbClr>
+                                </w14:glow>
+                                <w14:textOutline w14:w="9525" w14:cap="rnd" w14:cmpd="sng" w14:algn="ctr">
+                                  <w14:solidFill>
+                                    <w14:srgbClr w14:val="C00000"/>
+                                  </w14:solidFill>
+                                  <w14:prstDash w14:val="solid"/>
+                                  <w14:bevel/>
+                                </w14:textOutline>
+                              </w:rPr>
+                              <w:t>s</w:t>
+                            </w:r>
+                            <w:r>
+                              <w:rPr>
+                                <w:rFonts w:ascii="Modern No. 20" w:hAnsi="Modern No. 20"/>
+                                <w:color w:val="000000" w:themeColor="text1"/>
+                                <w:sz w:val="44"/>
+                                <w:szCs w:val="44"/>
+                                <w14:glow w14:rad="101600">
+                                  <w14:srgbClr w14:val="C00000">
+                                    <w14:alpha w14:val="40000"/>
+                                  </w14:srgbClr>
+                                </w14:glow>
+                                <w14:textOutline w14:w="9525" w14:cap="rnd" w14:cmpd="sng" w14:algn="ctr">
+                                  <w14:solidFill>
+                                    <w14:srgbClr w14:val="C00000"/>
+                                  </w14:solidFill>
+                                  <w14:prstDash w14:val="solid"/>
+                                  <w14:bevel/>
+                                </w14:textOutline>
+                              </w:rPr>
+                              <w:t>App-Kanal</w:t>
+                            </w:r>
+                            <w:r>
+                              <w:rPr>
+                                <w:rFonts w:ascii="Modern No. 20" w:hAnsi="Modern No. 20"/>
+                                <w:color w:val="000000" w:themeColor="text1"/>
+                                <w:sz w:val="44"/>
+                                <w:szCs w:val="44"/>
+                                <w14:glow w14:rad="101600">
+                                  <w14:srgbClr w14:val="C00000">
+                                    <w14:alpha w14:val="40000"/>
+                                  </w14:srgbClr>
+                                </w14:glow>
+                                <w14:textOutline w14:w="9525" w14:cap="rnd" w14:cmpd="sng" w14:algn="ctr">
+                                  <w14:solidFill>
+                                    <w14:srgbClr w14:val="C00000"/>
+                                  </w14:solidFill>
+                                  <w14:prstDash w14:val="solid"/>
+                                  <w14:bevel/>
+                                </w14:textOutline>
+                              </w:rPr>
+                              <w:t>!</w:t>
                             </w:r>
                           </w:p>
                         </w:txbxContent>
@@ -117,11 +180,11 @@
           </mc:Choice>
           <mc:Fallback>
             <w:pict>
-              <v:shapetype w14:anchorId="14148F2F" id="_x0000_t202" coordsize="21600,21600" o:spt="202" path="m,l,21600r21600,l21600,xe">
+              <v:shapetype w14:anchorId="66066D0F" id="_x0000_t202" coordsize="21600,21600" o:spt="202" path="m,l,21600r21600,l21600,xe">
                 <v:stroke joinstyle="miter"/>
                 <v:path gradientshapeok="t" o:connecttype="rect"/>
               </v:shapetype>
-              <v:shape id="Textfeld 2" o:spid="_x0000_s1026" type="#_x0000_t202" style="position:absolute;margin-left:78.5pt;margin-top:960.25pt;width:488.1pt;height:177.65pt;z-index:251730944;visibility:visible;mso-wrap-style:square;mso-width-percent:0;mso-height-percent:0;mso-wrap-distance-left:9pt;mso-wrap-distance-top:0;mso-wrap-distance-right:9pt;mso-wrap-distance-bottom:0;mso-position-horizontal:absolute;mso-position-horizontal-relative:margin;mso-position-vertical:absolute;mso-position-vertical-relative:text;mso-width-percent:0;mso-height-percent:0;mso-width-relative:margin;mso-height-relative:margin;v-text-anchor:top" o:gfxdata="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" filled="f" stroked="f">
+              <v:shape id="Textfeld 2" o:spid="_x0000_s1026" type="#_x0000_t202" style="position:absolute;margin-left:37.3pt;margin-top:1035.5pt;width:573.5pt;height:36pt;z-index:251732992;visibility:visible;mso-wrap-style:square;mso-width-percent:0;mso-height-percent:0;mso-wrap-distance-left:9pt;mso-wrap-distance-top:0;mso-wrap-distance-right:9pt;mso-wrap-distance-bottom:0;mso-position-horizontal:absolute;mso-position-horizontal-relative:margin;mso-position-vertical:absolute;mso-position-vertical-relative:text;mso-width-percent:0;mso-height-percent:0;mso-width-relative:margin;mso-height-relative:margin;v-text-anchor:top" o:gfxdata="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" filled="f" stroked="f">
                 <v:textbox>
                   <w:txbxContent>
                     <w:p>
@@ -130,8 +193,8 @@
                         <w:rPr>
                           <w:rFonts w:ascii="Modern No. 20" w:hAnsi="Modern No. 20"/>
                           <w:color w:val="C00000"/>
-                          <w:sz w:val="130"/>
-                          <w:szCs w:val="130"/>
+                          <w:sz w:val="44"/>
+                          <w:szCs w:val="44"/>
                           <w14:glow w14:rad="101600">
                             <w14:srgbClr w14:val="C00000">
                               <w14:alpha w14:val="40000"/>
@@ -150,8 +213,8 @@
                         <w:rPr>
                           <w:rFonts w:ascii="Modern No. 20" w:hAnsi="Modern No. 20"/>
                           <w:color w:val="000000" w:themeColor="text1"/>
-                          <w:sz w:val="130"/>
-                          <w:szCs w:val="130"/>
+                          <w:sz w:val="44"/>
+                          <w:szCs w:val="44"/>
                           <w14:glow w14:rad="101600">
                             <w14:srgbClr w14:val="C00000">
                               <w14:alpha w14:val="40000"/>
@@ -165,8 +228,281 @@
                             <w14:bevel/>
                           </w14:textOutline>
                         </w:rPr>
-                        <w:t>AUF GEHT’S WÖLFE</w:t>
+                        <w:t>Verfolgt das Spiel Live über unseren What</w:t>
                       </w:r>
+                      <w:r>
+                        <w:rPr>
+                          <w:rFonts w:ascii="Modern No. 20" w:hAnsi="Modern No. 20"/>
+                          <w:color w:val="000000" w:themeColor="text1"/>
+                          <w:sz w:val="44"/>
+                          <w:szCs w:val="44"/>
+                          <w14:glow w14:rad="101600">
+                            <w14:srgbClr w14:val="C00000">
+                              <w14:alpha w14:val="40000"/>
+                            </w14:srgbClr>
+                          </w14:glow>
+                          <w14:textOutline w14:w="9525" w14:cap="rnd" w14:cmpd="sng" w14:algn="ctr">
+                            <w14:solidFill>
+                              <w14:srgbClr w14:val="C00000"/>
+                            </w14:solidFill>
+                            <w14:prstDash w14:val="solid"/>
+                            <w14:bevel/>
+                          </w14:textOutline>
+                        </w:rPr>
+                        <w:t>s</w:t>
+                      </w:r>
+                      <w:r>
+                        <w:rPr>
+                          <w:rFonts w:ascii="Modern No. 20" w:hAnsi="Modern No. 20"/>
+                          <w:color w:val="000000" w:themeColor="text1"/>
+                          <w:sz w:val="44"/>
+                          <w:szCs w:val="44"/>
+                          <w14:glow w14:rad="101600">
+                            <w14:srgbClr w14:val="C00000">
+                              <w14:alpha w14:val="40000"/>
+                            </w14:srgbClr>
+                          </w14:glow>
+                          <w14:textOutline w14:w="9525" w14:cap="rnd" w14:cmpd="sng" w14:algn="ctr">
+                            <w14:solidFill>
+                              <w14:srgbClr w14:val="C00000"/>
+                            </w14:solidFill>
+                            <w14:prstDash w14:val="solid"/>
+                            <w14:bevel/>
+                          </w14:textOutline>
+                        </w:rPr>
+                        <w:t>App-Kanal</w:t>
+                      </w:r>
+                      <w:r>
+                        <w:rPr>
+                          <w:rFonts w:ascii="Modern No. 20" w:hAnsi="Modern No. 20"/>
+                          <w:color w:val="000000" w:themeColor="text1"/>
+                          <w:sz w:val="44"/>
+                          <w:szCs w:val="44"/>
+                          <w14:glow w14:rad="101600">
+                            <w14:srgbClr w14:val="C00000">
+                              <w14:alpha w14:val="40000"/>
+                            </w14:srgbClr>
+                          </w14:glow>
+                          <w14:textOutline w14:w="9525" w14:cap="rnd" w14:cmpd="sng" w14:algn="ctr">
+                            <w14:solidFill>
+                              <w14:srgbClr w14:val="C00000"/>
+                            </w14:solidFill>
+                            <w14:prstDash w14:val="solid"/>
+                            <w14:bevel/>
+                          </w14:textOutline>
+                        </w:rPr>
+                        <w:t>!</w:t>
+                      </w:r>
+                    </w:p>
+                  </w:txbxContent>
+                </v:textbox>
+                <w10:wrap anchorx="margin"/>
+              </v:shape>
+            </w:pict>
+          </mc:Fallback>
+        </mc:AlternateContent>
+      </w:r>
+      <w:r>
+        <w:rPr>
+          <w:noProof/>
+        </w:rPr>
+        <mc:AlternateContent>
+          <mc:Choice Requires="wps">
+            <w:drawing>
+              <wp:anchor distT="0" distB="0" distL="114300" distR="114300" simplePos="0" relativeHeight="251730944" behindDoc="0" locked="0" layoutInCell="1" allowOverlap="1" wp14:anchorId="14148F2F" wp14:editId="4AA246EA">
+                <wp:simplePos x="0" y="0"/>
+                <wp:positionH relativeFrom="margin">
+                  <wp:align>center</wp:align>
+                </wp:positionH>
+                <wp:positionV relativeFrom="paragraph">
+                  <wp:posOffset>12327431</wp:posOffset>
+                </wp:positionV>
+                <wp:extent cx="6385035" cy="945931"/>
+                <wp:effectExtent l="0" t="0" r="0" b="0"/>
+                <wp:wrapNone/>
+                <wp:docPr id="1869927516" name="Textfeld 2"/>
+                <wp:cNvGraphicFramePr>
+                  <a:graphicFrameLocks xmlns:a="http://schemas.openxmlformats.org/drawingml/2006/main"/>
+                </wp:cNvGraphicFramePr>
+                <a:graphic xmlns:a="http://schemas.openxmlformats.org/drawingml/2006/main">
+                  <a:graphicData uri="http://schemas.microsoft.com/office/word/2010/wordprocessingShape">
+                    <wps:wsp>
+                      <wps:cNvSpPr txBox="1">
+                        <a:spLocks noChangeArrowheads="1"/>
+                      </wps:cNvSpPr>
+                      <wps:spPr bwMode="auto">
+                        <a:xfrm>
+                          <a:off x="0" y="0"/>
+                          <a:ext cx="6385035" cy="945931"/>
+                        </a:xfrm>
+                        <a:prstGeom prst="rect">
+                          <a:avLst/>
+                        </a:prstGeom>
+                        <a:noFill/>
+                        <a:ln w="9525">
+                          <a:noFill/>
+                          <a:miter lim="800000"/>
+                          <a:headEnd/>
+                          <a:tailEnd/>
+                        </a:ln>
+                      </wps:spPr>
+                      <wps:txbx>
+                        <w:txbxContent>
+                          <w:p>
+                            <w:pPr>
+                              <w:jc w:val="center"/>
+                              <w:rPr>
+                                <w:rFonts w:ascii="Modern No. 20" w:hAnsi="Modern No. 20"/>
+                                <w:color w:val="C00000"/>
+                                <w:sz w:val="100"/>
+                                <w:szCs w:val="100"/>
+                                <w14:glow w14:rad="101600">
+                                  <w14:srgbClr w14:val="C00000">
+                                    <w14:alpha w14:val="40000"/>
+                                  </w14:srgbClr>
+                                </w14:glow>
+                                <w14:textOutline w14:w="9525" w14:cap="rnd" w14:cmpd="sng" w14:algn="ctr">
+                                  <w14:solidFill>
+                                    <w14:srgbClr w14:val="C00000"/>
+                                  </w14:solidFill>
+                                  <w14:prstDash w14:val="solid"/>
+                                  <w14:bevel/>
+                                </w14:textOutline>
+                              </w:rPr>
+                            </w:pPr>
+                            <w:r>
+                              <w:rPr>
+                                <w:rFonts w:ascii="Modern No. 20" w:hAnsi="Modern No. 20"/>
+                                <w:color w:val="000000" w:themeColor="text1"/>
+                                <w:sz w:val="100"/>
+                                <w:szCs w:val="100"/>
+                                <w14:glow w14:rad="101600">
+                                  <w14:srgbClr w14:val="C00000">
+                                    <w14:alpha w14:val="40000"/>
+                                  </w14:srgbClr>
+                                </w14:glow>
+                                <w14:textOutline w14:w="9525" w14:cap="rnd" w14:cmpd="sng" w14:algn="ctr">
+                                  <w14:solidFill>
+                                    <w14:srgbClr w14:val="C00000"/>
+                                  </w14:solidFill>
+                                  <w14:prstDash w14:val="solid"/>
+                                  <w14:bevel/>
+                                </w14:textOutline>
+                              </w:rPr>
+                              <w:t xml:space="preserve">AUF GEHT’S </w:t>
+                            </w:r>
+                            <w:proofErr w:type="spellStart"/>
+                            <w:r>
+                              <w:rPr>
+                                <w:rFonts w:ascii="Modern No. 20" w:hAnsi="Modern No. 20"/>
+                                <w:color w:val="000000" w:themeColor="text1"/>
+                                <w:sz w:val="100"/>
+                                <w:szCs w:val="100"/>
+                                <w14:glow w14:rad="101600">
+                                  <w14:srgbClr w14:val="C00000">
+                                    <w14:alpha w14:val="40000"/>
+                                  </w14:srgbClr>
+                                </w14:glow>
+                                <w14:textOutline w14:w="9525" w14:cap="rnd" w14:cmpd="sng" w14:algn="ctr">
+                                  <w14:solidFill>
+                                    <w14:srgbClr w14:val="C00000"/>
+                                  </w14:solidFill>
+                                  <w14:prstDash w14:val="solid"/>
+                                  <w14:bevel/>
+                                </w14:textOutline>
+                              </w:rPr>
+                              <w:t>WÖLFE</w:t>
+                            </w:r>
+                            <w:proofErr w:type="spellEnd"/>
+                          </w:p>
+                        </w:txbxContent>
+                      </wps:txbx>
+                      <wps:bodyPr rot="0" vert="horz" wrap="square" lIns="91440" tIns="45720" rIns="91440" bIns="45720" anchor="t" anchorCtr="0">
+                        <a:noAutofit/>
+                      </wps:bodyPr>
+                    </wps:wsp>
+                  </a:graphicData>
+                </a:graphic>
+                <wp14:sizeRelH relativeFrom="margin">
+                  <wp14:pctWidth>0</wp14:pctWidth>
+                </wp14:sizeRelH>
+                <wp14:sizeRelV relativeFrom="margin">
+                  <wp14:pctHeight>0</wp14:pctHeight>
+                </wp14:sizeRelV>
+              </wp:anchor>
+            </w:drawing>
+          </mc:Choice>
+          <mc:Fallback>
+            <w:pict>
+              <v:shape w14:anchorId="14148F2F" id="_x0000_s1027" type="#_x0000_t202" style="position:absolute;margin-left:0;margin-top:970.65pt;width:502.75pt;height:74.5pt;z-index:251730944;visibility:visible;mso-wrap-style:square;mso-width-percent:0;mso-height-percent:0;mso-wrap-distance-left:9pt;mso-wrap-distance-top:0;mso-wrap-distance-right:9pt;mso-wrap-distance-bottom:0;mso-position-horizontal:center;mso-position-horizontal-relative:margin;mso-position-vertical:absolute;mso-position-vertical-relative:text;mso-width-percent:0;mso-height-percent:0;mso-width-relative:margin;mso-height-relative:margin;v-text-anchor:top" o:gfxdata="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" filled="f" stroked="f">
+                <v:textbox>
+                  <w:txbxContent>
+                    <w:p>
+                      <w:pPr>
+                        <w:jc w:val="center"/>
+                        <w:rPr>
+                          <w:rFonts w:ascii="Modern No. 20" w:hAnsi="Modern No. 20"/>
+                          <w:color w:val="C00000"/>
+                          <w:sz w:val="100"/>
+                          <w:szCs w:val="100"/>
+                          <w14:glow w14:rad="101600">
+                            <w14:srgbClr w14:val="C00000">
+                              <w14:alpha w14:val="40000"/>
+                            </w14:srgbClr>
+                          </w14:glow>
+                          <w14:textOutline w14:w="9525" w14:cap="rnd" w14:cmpd="sng" w14:algn="ctr">
+                            <w14:solidFill>
+                              <w14:srgbClr w14:val="C00000"/>
+                            </w14:solidFill>
+                            <w14:prstDash w14:val="solid"/>
+                            <w14:bevel/>
+                          </w14:textOutline>
+                        </w:rPr>
+                      </w:pPr>
+                      <w:r>
+                        <w:rPr>
+                          <w:rFonts w:ascii="Modern No. 20" w:hAnsi="Modern No. 20"/>
+                          <w:color w:val="000000" w:themeColor="text1"/>
+                          <w:sz w:val="100"/>
+                          <w:szCs w:val="100"/>
+                          <w14:glow w14:rad="101600">
+                            <w14:srgbClr w14:val="C00000">
+                              <w14:alpha w14:val="40000"/>
+                            </w14:srgbClr>
+                          </w14:glow>
+                          <w14:textOutline w14:w="9525" w14:cap="rnd" w14:cmpd="sng" w14:algn="ctr">
+                            <w14:solidFill>
+                              <w14:srgbClr w14:val="C00000"/>
+                            </w14:solidFill>
+                            <w14:prstDash w14:val="solid"/>
+                            <w14:bevel/>
+                          </w14:textOutline>
+                        </w:rPr>
+                        <w:t xml:space="preserve">AUF GEHT’S </w:t>
+                      </w:r>
+                      <w:proofErr w:type="spellStart"/>
+                      <w:r>
+                        <w:rPr>
+                          <w:rFonts w:ascii="Modern No. 20" w:hAnsi="Modern No. 20"/>
+                          <w:color w:val="000000" w:themeColor="text1"/>
+                          <w:sz w:val="100"/>
+                          <w:szCs w:val="100"/>
+                          <w14:glow w14:rad="101600">
+                            <w14:srgbClr w14:val="C00000">
+                              <w14:alpha w14:val="40000"/>
+                            </w14:srgbClr>
+                          </w14:glow>
+                          <w14:textOutline w14:w="9525" w14:cap="rnd" w14:cmpd="sng" w14:algn="ctr">
+                            <w14:solidFill>
+                              <w14:srgbClr w14:val="C00000"/>
+                            </w14:solidFill>
+                            <w14:prstDash w14:val="solid"/>
+                            <w14:bevel/>
+                          </w14:textOutline>
+                        </w:rPr>
+                        <w:t>WÖLFE</w:t>
+                      </w:r>
+                      <w:proofErr w:type="spellEnd"/>
                     </w:p>
                   </w:txbxContent>
                 </v:textbox>
@@ -1498,11 +1834,7 @@
           </mc:Choice>
           <mc:Fallback>
             <w:pict>
-              <v:shapetype w14:anchorId="432CF5C2" id="_x0000_t202" coordsize="21600,21600" o:spt="202" path="m,l,21600r21600,l21600,xe">
-                <v:stroke joinstyle="miter"/>
-                <v:path gradientshapeok="t" o:connecttype="rect"/>
-              </v:shapetype>
-              <v:shape id="_x0000_s1027" type="#_x0000_t202" style="position:absolute;margin-left:79.5pt;margin-top:181.85pt;width:488.95pt;height:642.6pt;z-index:251719680;visibility:visible;mso-wrap-style:square;mso-width-percent:0;mso-height-percent:0;mso-wrap-distance-left:9pt;mso-wrap-distance-top:3.6pt;mso-wrap-distance-right:9pt;mso-wrap-distance-bottom:3.6pt;mso-position-horizontal:absolute;mso-position-horizontal-relative:text;mso-position-vertical:absolute;mso-position-vertical-relative:text;mso-width-percent:0;mso-height-percent:0;mso-width-relative:margin;mso-height-relative:margin;v-text-anchor:middle" o:gfxdata="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" filled="f" stroked="f">
+              <v:shape w14:anchorId="432CF5C2" id="_x0000_s1028" type="#_x0000_t202" style="position:absolute;margin-left:79.5pt;margin-top:181.85pt;width:488.95pt;height:642.6pt;z-index:251719680;visibility:visible;mso-wrap-style:square;mso-width-percent:0;mso-height-percent:0;mso-wrap-distance-left:9pt;mso-wrap-distance-top:3.6pt;mso-wrap-distance-right:9pt;mso-wrap-distance-bottom:3.6pt;mso-position-horizontal:absolute;mso-position-horizontal-relative:text;mso-position-vertical:absolute;mso-position-vertical-relative:text;mso-width-percent:0;mso-height-percent:0;mso-width-relative:margin;mso-height-relative:margin;v-text-anchor:middle" o:gfxdata="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" filled="f" stroked="f">
                 <v:textbox>
                   <w:txbxContent>
                     <w:tbl>
@@ -3572,7 +3904,7 @@
         <mc:AlternateContent>
           <mc:Choice Requires="wps">
             <w:drawing>
-              <wp:anchor distT="45720" distB="45720" distL="114300" distR="114300" simplePos="0" relativeHeight="251723776" behindDoc="0" locked="0" layoutInCell="1" allowOverlap="1" wp14:anchorId="3CF90A33" wp14:editId="47A03742">
+              <wp:anchor distT="45720" distB="45720" distL="114300" distR="114300" simplePos="0" relativeHeight="251723776" behindDoc="0" locked="0" layoutInCell="1" allowOverlap="1" wp14:anchorId="3CF90A33" wp14:editId="549D2F82">
                 <wp:simplePos x="0" y="0"/>
                 <wp:positionH relativeFrom="margin">
                   <wp:posOffset>1487607</wp:posOffset>
@@ -3714,7 +4046,7 @@
           <w:noProof/>
         </w:rPr>
         <w:drawing>
-          <wp:anchor distT="0" distB="0" distL="114300" distR="114300" simplePos="0" relativeHeight="251715584" behindDoc="1" locked="0" layoutInCell="1" allowOverlap="1" wp14:anchorId="26ECA0FA" wp14:editId="5612BE6D">
+          <wp:anchor distT="0" distB="0" distL="114300" distR="114300" simplePos="0" relativeHeight="251715584" behindDoc="1" locked="0" layoutInCell="1" allowOverlap="1" wp14:anchorId="26ECA0FA" wp14:editId="7E8CE626">
             <wp:simplePos x="0" y="0"/>
             <wp:positionH relativeFrom="margin">
               <wp:align>left</wp:align>

</xml_diff>